<commit_message>
Handover package v1.4: README, acceptance checklist (64 checks incl. package 4), draft act (13 stages), sources archive v1.4, fresh E2E screenshots + report; demo DB cleaned (stray test user removed)
</commit_message>
<xml_diff>
--- a/handover/Акт_выполненных_работ_ЧЕРНОВИК.docx
+++ b/handover/Акт_выполненных_работ_ЧЕРНОВИК.docx
@@ -171,7 +171,7 @@
           <w:sz w:val="24"/>
           <w:szCs w:val="24"/>
         </w:rPr>
-        <w:t xml:space="preserve">, в лице 【должность, ФИО】, действующего на основании 【устава / доверенности № ___】, с другой стороны, совместно именуемые «Стороны», составили настоящий акт в том, что Исполнитель выполнил, а Заказчик принял работы по разработке веб-приложения «МРТ ТОЧНО» — CRM-системы учёта и сопровождения направляющих врачей (далее — «Приложение») — в соответствии с техническим заданием «ТЗ 2.0» и согласованными Сторонами уточнениями (пакеты доработок №№ 1–3, итерации 1.1–1.3).</w:t>
+        <w:t xml:space="preserve">, в лице 【должность, ФИО】, действующего на основании 【устава / доверенности № ___】, с другой стороны, совместно именуемые «Стороны», составили настоящий акт в том, что Исполнитель выполнил, а Заказчик принял работы по разработке веб-приложения «МРТ ТОЧНО» — CRM-системы учёта и сопровождения направляющих врачей (далее — «Приложение») — в соответствии с техническим заданием «ТЗ 2.0» и согласованными Сторонами уточнениями (пакеты доработок №№ 1–4, итерации 1.1–1.4).</w:t>
       </w:r>
     </w:p>
     <w:p>
@@ -439,7 +439,7 @@
                 <w:sz w:val="21"/>
                 <w:szCs w:val="21"/>
               </w:rPr>
-              <w:t xml:space="preserve">Изучение технического задания «ТЗ 2.0» и гайдлайна бренда «МРТ ТОЧНО»; согласование пакетов доработок №№ 1–3; проектирование структуры данных и пользовательского интерфейса.</w:t>
+              <w:t xml:space="preserve">Изучение технического задания «ТЗ 2.0» и гайдлайна бренда «МРТ ТОЧНО»; согласование пакетов доработок №№ 1–4; проектирование структуры данных и пользовательского интерфейса.</w:t>
             </w:r>
           </w:p>
         </w:tc>
@@ -1698,7 +1698,7 @@
                 <w:sz w:val="21"/>
                 <w:szCs w:val="21"/>
               </w:rPr>
-              <w:t xml:space="preserve">Тестирование</w:t>
+              <w:t xml:space="preserve">Доработки (пакет №4)</w:t>
             </w:r>
           </w:p>
         </w:tc>
@@ -1729,7 +1729,7 @@
                 <w:sz w:val="21"/>
                 <w:szCs w:val="21"/>
               </w:rPr>
-              <w:t xml:space="preserve">Сквозные (E2E) проверки в браузере всех модулей под обеими ролями; исправление выявленных дефектов; мобильная адаптация интерфейса.</w:t>
+              <w:t xml:space="preserve">Упрощение регистрации заявки: обязательные поля — только «Дата» (предзаполнена) и «ФИО пациента»; НВ и ЛПУ опциональны («Не указан»/«Не указано»), обрывочная информация от пациента фиксируется в «Комментарии»; корректное отображение заявок без НВ/ЛПУ в списках, отчётах и рейтинге. Пометка данных «на удаление» в духе 1С: пользователи, НВ, ЛПУ, номенклатура и специализации не удаляются физически — бейдж «Помечен(о) на удаление», зачёркивание, восстановление одной кнопкой, исключение помеченных из выпадающих списков и фильтров. Замена логотипов на оригинальные: белая версия на тёмном фоне (панель входа, боковая панель), цветная на светлом (мобильный вход, подвал), фирменный favicon.</w:t>
             </w:r>
           </w:p>
         </w:tc>
@@ -1760,7 +1760,7 @@
                 <w:sz w:val="21"/>
                 <w:szCs w:val="21"/>
               </w:rPr>
-              <w:t xml:space="preserve">Работоспособность подтверждена (материалы E2E-проверок переданы).</w:t>
+              <w:t xml:space="preserve">Доработки по обратной связи заказчика внедрены и проверены.</w:t>
             </w:r>
           </w:p>
         </w:tc>
@@ -1797,6 +1797,135 @@
                 <w:szCs w:val="21"/>
               </w:rPr>
               <w:t xml:space="preserve">12</w:t>
+            </w:r>
+          </w:p>
+        </w:tc>
+        <w:tc>
+          <w:tcPr>
+            <w:tcW w:type="pct" w:w="20%"/>
+            <w:tcMar>
+              <w:top w:type="dxa" w:w="60"/>
+              <w:left w:type="dxa" w:w="100"/>
+              <w:bottom w:type="dxa" w:w="60"/>
+              <w:right w:type="dxa" w:w="100"/>
+            </w:tcMar>
+            <w:vAlign w:val="center"/>
+          </w:tcPr>
+          <w:p>
+            <w:pPr>
+              <w:spacing w:after="40"/>
+              <w:jc w:val="left"/>
+            </w:pPr>
+            <w:r>
+              <w:rPr>
+                <w:rFonts w:ascii="Times New Roman" w:cs="Times New Roman" w:eastAsia="Times New Roman" w:hAnsi="Times New Roman"/>
+                <w:b w:val="false"/>
+                <w:bCs w:val="false"/>
+                <w:i w:val="false"/>
+                <w:iCs w:val="false"/>
+                <w:color w:val="000000"/>
+                <w:sz w:val="21"/>
+                <w:szCs w:val="21"/>
+              </w:rPr>
+              <w:t xml:space="preserve">Тестирование</w:t>
+            </w:r>
+          </w:p>
+        </w:tc>
+        <w:tc>
+          <w:tcPr>
+            <w:tcW w:type="pct" w:w="49%"/>
+            <w:tcMar>
+              <w:top w:type="dxa" w:w="60"/>
+              <w:left w:type="dxa" w:w="100"/>
+              <w:bottom w:type="dxa" w:w="60"/>
+              <w:right w:type="dxa" w:w="100"/>
+            </w:tcMar>
+            <w:vAlign w:val="center"/>
+          </w:tcPr>
+          <w:p>
+            <w:pPr>
+              <w:spacing w:after="40"/>
+              <w:jc w:val="left"/>
+            </w:pPr>
+            <w:r>
+              <w:rPr>
+                <w:rFonts w:ascii="Times New Roman" w:cs="Times New Roman" w:eastAsia="Times New Roman" w:hAnsi="Times New Roman"/>
+                <w:b w:val="false"/>
+                <w:bCs w:val="false"/>
+                <w:i w:val="false"/>
+                <w:iCs w:val="false"/>
+                <w:color w:val="000000"/>
+                <w:sz w:val="21"/>
+                <w:szCs w:val="21"/>
+              </w:rPr>
+              <w:t xml:space="preserve">Сквозные (E2E) проверки в браузере всех модулей под обеими ролями, включая повторную верификацию после каждого пакета доработок; исправление выявленных дефектов; мобильная адаптация интерфейса.</w:t>
+            </w:r>
+          </w:p>
+        </w:tc>
+        <w:tc>
+          <w:tcPr>
+            <w:tcW w:type="pct" w:w="25%"/>
+            <w:tcMar>
+              <w:top w:type="dxa" w:w="60"/>
+              <w:left w:type="dxa" w:w="100"/>
+              <w:bottom w:type="dxa" w:w="60"/>
+              <w:right w:type="dxa" w:w="100"/>
+            </w:tcMar>
+            <w:vAlign w:val="center"/>
+          </w:tcPr>
+          <w:p>
+            <w:pPr>
+              <w:spacing w:after="40"/>
+              <w:jc w:val="left"/>
+            </w:pPr>
+            <w:r>
+              <w:rPr>
+                <w:rFonts w:ascii="Times New Roman" w:cs="Times New Roman" w:eastAsia="Times New Roman" w:hAnsi="Times New Roman"/>
+                <w:b w:val="false"/>
+                <w:bCs w:val="false"/>
+                <w:i w:val="false"/>
+                <w:iCs w:val="false"/>
+                <w:color w:val="000000"/>
+                <w:sz w:val="21"/>
+                <w:szCs w:val="21"/>
+              </w:rPr>
+              <w:t xml:space="preserve">Работоспособность подтверждена (материалы E2E-проверок переданы).</w:t>
+            </w:r>
+          </w:p>
+        </w:tc>
+      </w:tr>
+      <w:tr>
+        <w:trPr>
+          <w:cantSplit/>
+        </w:trPr>
+        <w:tc>
+          <w:tcPr>
+            <w:tcW w:type="pct" w:w="6%"/>
+            <w:tcMar>
+              <w:top w:type="dxa" w:w="60"/>
+              <w:left w:type="dxa" w:w="100"/>
+              <w:bottom w:type="dxa" w:w="60"/>
+              <w:right w:type="dxa" w:w="100"/>
+            </w:tcMar>
+            <w:vAlign w:val="center"/>
+          </w:tcPr>
+          <w:p>
+            <w:pPr>
+              <w:spacing w:after="40"/>
+              <w:jc w:val="center"/>
+            </w:pPr>
+            <w:r>
+              <w:rPr>
+                <w:rFonts w:ascii="Times New Roman" w:cs="Times New Roman" w:eastAsia="Times New Roman" w:hAnsi="Times New Roman"/>
+                <w:b w:val="false"/>
+                <w:bCs w:val="false"/>
+                <w:i w:val="false"/>
+                <w:iCs w:val="false"/>
+                <w:color w:val="000000"/>
+                <w:sz w:val="21"/>
+                <w:szCs w:val="21"/>
+              </w:rPr>
+              <w:t xml:space="preserve">13</w:t>
             </w:r>
           </w:p>
         </w:tc>
@@ -1957,7 +2086,7 @@
           <w:sz w:val="24"/>
           <w:szCs w:val="24"/>
         </w:rPr>
-        <w:t xml:space="preserve">архив исходных кодов Приложения (включая файл базы данных с демонстрационными данными) — mrt-tno-crm-sources-v1.3.zip;</w:t>
+        <w:t xml:space="preserve">архив исходных кодов Приложения (включая файл базы данных с демонстрационными данными) — mrt-tno-crm-sources-v1.4.zip;</w:t>
       </w:r>
     </w:p>
     <w:p>

</xml_diff>

<commit_message>
Handover package v1.5: mobile-first included (README, checklist 75 checks, act 14 stages, sources archive v1.5, fresh E2E report v15-01..16); demo DB finished cleanup (test user a.semenova removed, Komarov back to a.petrov, DB == seed)
</commit_message>
<xml_diff>
--- a/handover/Акт_выполненных_работ_ЧЕРНОВИК.docx
+++ b/handover/Акт_выполненных_работ_ЧЕРНОВИК.docx
@@ -171,7 +171,7 @@
           <w:sz w:val="24"/>
           <w:szCs w:val="24"/>
         </w:rPr>
-        <w:t xml:space="preserve">, в лице 【должность, ФИО】, действующего на основании 【устава / доверенности № ___】, с другой стороны, совместно именуемые «Стороны», составили настоящий акт в том, что Исполнитель выполнил, а Заказчик принял работы по разработке веб-приложения «МРТ ТОЧНО» — CRM-системы учёта и сопровождения направляющих врачей (далее — «Приложение») — в соответствии с техническим заданием «ТЗ 2.0» и согласованными Сторонами уточнениями (пакеты доработок №№ 1–4, итерации 1.1–1.4).</w:t>
+        <w:t xml:space="preserve">, в лице 【должность, ФИО】, действующего на основании 【устава / доверенности № ___】, с другой стороны, совместно именуемые «Стороны», составили настоящий акт в том, что Исполнитель выполнил, а Заказчик принял работы по разработке веб-приложения «МРТ ТОЧНО» — CRM-системы учёта и сопровождения направляющих врачей (далее — «Приложение») — в соответствии с техническим заданием «ТЗ 2.0» и согласованными Сторонами уточнениями (пакеты доработок №№ 1–4, итерации 1.1–1.5, включая mobile-first редизайн интерфейса).</w:t>
       </w:r>
     </w:p>
     <w:p>
@@ -1827,7 +1827,7 @@
                 <w:sz w:val="21"/>
                 <w:szCs w:val="21"/>
               </w:rPr>
-              <w:t xml:space="preserve">Тестирование</w:t>
+              <w:t xml:space="preserve">Mobile-first редизайн</w:t>
             </w:r>
           </w:p>
         </w:tc>
@@ -1858,7 +1858,7 @@
                 <w:sz w:val="21"/>
                 <w:szCs w:val="21"/>
               </w:rPr>
-              <w:t xml:space="preserve">Сквозные (E2E) проверки в браузере всех модулей под обеими ролями, включая повторную верификацию после каждого пакета доработок; исправление выявленных дефектов; мобильная адаптация интерфейса.</w:t>
+              <w:t xml:space="preserve">Адаптация интерфейса под работу медпредставителя со смартфона на приёме у врача: мобильная навигация (нижний таб-бар с тач-зонами от 44 px и меню «Ещё», тёмный топ-бар с названием раздела), карточки заявок вместо таблиц, формы заявки и визита в виде нижних листов (bottom-sheet) с закреплёнными кнопками и крупными полями ввода, кнопки быстрых действий (FAB) «Зарегистрировать заявку» и «Запланировать визит», мобильный календарь — «Месяц» с индикаторами статусов, «Неделя» вертикальным списком дней, «День» с почасовыми слотами и быстрым планированием; перенос визитов без перетаскивания — нативными полями даты/времени в карточке визита; учёт safe-area вырезов экрана. Десктопная версия в стиле 1С сохранена без функциональных изменений.</w:t>
             </w:r>
           </w:p>
         </w:tc>
@@ -1889,7 +1889,7 @@
                 <w:sz w:val="21"/>
                 <w:szCs w:val="21"/>
               </w:rPr>
-              <w:t xml:space="preserve">Работоспособность подтверждена (материалы E2E-проверок переданы).</w:t>
+              <w:t xml:space="preserve">CRM пригодна для работы со смартфона непосредственно на приёме у врача (проверено на экране 390×844).</w:t>
             </w:r>
           </w:p>
         </w:tc>
@@ -1926,6 +1926,135 @@
                 <w:szCs w:val="21"/>
               </w:rPr>
               <w:t xml:space="preserve">13</w:t>
+            </w:r>
+          </w:p>
+        </w:tc>
+        <w:tc>
+          <w:tcPr>
+            <w:tcW w:type="pct" w:w="20%"/>
+            <w:tcMar>
+              <w:top w:type="dxa" w:w="60"/>
+              <w:left w:type="dxa" w:w="100"/>
+              <w:bottom w:type="dxa" w:w="60"/>
+              <w:right w:type="dxa" w:w="100"/>
+            </w:tcMar>
+            <w:vAlign w:val="center"/>
+          </w:tcPr>
+          <w:p>
+            <w:pPr>
+              <w:spacing w:after="40"/>
+              <w:jc w:val="left"/>
+            </w:pPr>
+            <w:r>
+              <w:rPr>
+                <w:rFonts w:ascii="Times New Roman" w:cs="Times New Roman" w:eastAsia="Times New Roman" w:hAnsi="Times New Roman"/>
+                <w:b w:val="false"/>
+                <w:bCs w:val="false"/>
+                <w:i w:val="false"/>
+                <w:iCs w:val="false"/>
+                <w:color w:val="000000"/>
+                <w:sz w:val="21"/>
+                <w:szCs w:val="21"/>
+              </w:rPr>
+              <w:t xml:space="preserve">Тестирование</w:t>
+            </w:r>
+          </w:p>
+        </w:tc>
+        <w:tc>
+          <w:tcPr>
+            <w:tcW w:type="pct" w:w="49%"/>
+            <w:tcMar>
+              <w:top w:type="dxa" w:w="60"/>
+              <w:left w:type="dxa" w:w="100"/>
+              <w:bottom w:type="dxa" w:w="60"/>
+              <w:right w:type="dxa" w:w="100"/>
+            </w:tcMar>
+            <w:vAlign w:val="center"/>
+          </w:tcPr>
+          <w:p>
+            <w:pPr>
+              <w:spacing w:after="40"/>
+              <w:jc w:val="left"/>
+            </w:pPr>
+            <w:r>
+              <w:rPr>
+                <w:rFonts w:ascii="Times New Roman" w:cs="Times New Roman" w:eastAsia="Times New Roman" w:hAnsi="Times New Roman"/>
+                <w:b w:val="false"/>
+                <w:bCs w:val="false"/>
+                <w:i w:val="false"/>
+                <w:iCs w:val="false"/>
+                <w:color w:val="000000"/>
+                <w:sz w:val="21"/>
+                <w:szCs w:val="21"/>
+              </w:rPr>
+              <w:t xml:space="preserve">Сквозные (E2E) проверки в браузере всех модулей под обеими ролями, включая повторную верификацию после каждого пакета доработок и после mobile-first редизайна (отдельно на десктопе 1440×900 и на смартфоне 390×844); исправление выявленных дефектов.</w:t>
+            </w:r>
+          </w:p>
+        </w:tc>
+        <w:tc>
+          <w:tcPr>
+            <w:tcW w:type="pct" w:w="25%"/>
+            <w:tcMar>
+              <w:top w:type="dxa" w:w="60"/>
+              <w:left w:type="dxa" w:w="100"/>
+              <w:bottom w:type="dxa" w:w="60"/>
+              <w:right w:type="dxa" w:w="100"/>
+            </w:tcMar>
+            <w:vAlign w:val="center"/>
+          </w:tcPr>
+          <w:p>
+            <w:pPr>
+              <w:spacing w:after="40"/>
+              <w:jc w:val="left"/>
+            </w:pPr>
+            <w:r>
+              <w:rPr>
+                <w:rFonts w:ascii="Times New Roman" w:cs="Times New Roman" w:eastAsia="Times New Roman" w:hAnsi="Times New Roman"/>
+                <w:b w:val="false"/>
+                <w:bCs w:val="false"/>
+                <w:i w:val="false"/>
+                <w:iCs w:val="false"/>
+                <w:color w:val="000000"/>
+                <w:sz w:val="21"/>
+                <w:szCs w:val="21"/>
+              </w:rPr>
+              <w:t xml:space="preserve">Работоспособность подтверждена (материалы E2E-проверок переданы).</w:t>
+            </w:r>
+          </w:p>
+        </w:tc>
+      </w:tr>
+      <w:tr>
+        <w:trPr>
+          <w:cantSplit/>
+        </w:trPr>
+        <w:tc>
+          <w:tcPr>
+            <w:tcW w:type="pct" w:w="6%"/>
+            <w:tcMar>
+              <w:top w:type="dxa" w:w="60"/>
+              <w:left w:type="dxa" w:w="100"/>
+              <w:bottom w:type="dxa" w:w="60"/>
+              <w:right w:type="dxa" w:w="100"/>
+            </w:tcMar>
+            <w:vAlign w:val="center"/>
+          </w:tcPr>
+          <w:p>
+            <w:pPr>
+              <w:spacing w:after="40"/>
+              <w:jc w:val="center"/>
+            </w:pPr>
+            <w:r>
+              <w:rPr>
+                <w:rFonts w:ascii="Times New Roman" w:cs="Times New Roman" w:eastAsia="Times New Roman" w:hAnsi="Times New Roman"/>
+                <w:b w:val="false"/>
+                <w:bCs w:val="false"/>
+                <w:i w:val="false"/>
+                <w:iCs w:val="false"/>
+                <w:color w:val="000000"/>
+                <w:sz w:val="21"/>
+                <w:szCs w:val="21"/>
+              </w:rPr>
+              <w:t xml:space="preserve">14</w:t>
             </w:r>
           </w:p>
         </w:tc>
@@ -2086,7 +2215,7 @@
           <w:sz w:val="24"/>
           <w:szCs w:val="24"/>
         </w:rPr>
-        <w:t xml:space="preserve">архив исходных кодов Приложения (включая файл базы данных с демонстрационными данными) — mrt-tno-crm-sources-v1.4.zip;</w:t>
+        <w:t xml:space="preserve">архив исходных кодов Приложения (включая файл базы данных с демонстрационными данными) — mrt-tno-crm-sources-v1.5.zip;</w:t>
       </w:r>
     </w:p>
     <w:p>

</xml_diff>